<commit_message>
DQE Task 3 updated minor mistake
</commit_message>
<xml_diff>
--- a/DQE Task 3/DQ_Introduction_Tamar_Tutisani.docx
+++ b/DQE Task 3/DQ_Introduction_Tamar_Tutisani.docx
@@ -227,10 +227,10 @@
         <w:pStyle w:val="BodyText"/>
       </w:pPr>
     </w:p>
-    <w:bookmarkStart w:id="2" w:name="_Toc4475558" w:displacedByCustomXml="next"/>
-    <w:bookmarkStart w:id="3" w:name="_Toc2484421" w:displacedByCustomXml="next"/>
-    <w:bookmarkStart w:id="4" w:name="_Toc456600918" w:displacedByCustomXml="next"/>
-    <w:bookmarkStart w:id="5" w:name="_Toc456598587" w:displacedByCustomXml="next"/>
+    <w:bookmarkStart w:id="2" w:name="_Toc456598587" w:displacedByCustomXml="next"/>
+    <w:bookmarkStart w:id="3" w:name="_Toc456600918" w:displacedByCustomXml="next"/>
+    <w:bookmarkStart w:id="4" w:name="_Toc2484421" w:displacedByCustomXml="next"/>
+    <w:bookmarkStart w:id="5" w:name="_Toc4475558" w:displacedByCustomXml="next"/>
     <w:sdt>
       <w:sdtPr>
         <w:rPr>
@@ -1343,7 +1343,40 @@
         <w:pStyle w:val="BodyText"/>
       </w:pPr>
       <w:r>
-        <w:t>This report presents findings from a comprehensive data quality analysis of two datasets: bank.csv and car_prices (converted from parquet format). The analysis employed multiple approaches including file format conversion, Excel profiling, and SQL-based queries to identify data anomalies. The bank dataset contains 4,521 customer records with 10 attributes, while the car prices dataset comprises vehicle sales records with 16 specification and transaction-related fields. Both datasets exhibit quality issues that require remediation before use in analytical or production systems. This report documents specific anomalies identified, their impact, and recommended actions.</w:t>
+        <w:t xml:space="preserve">This report presents findings from a comprehensive data quality analysis of two datasets: bank.csv and </w:t>
+      </w:r>
+      <w:proofErr w:type="spellStart"/>
+      <w:r>
+        <w:t>car_prices</w:t>
+      </w:r>
+      <w:proofErr w:type="spellEnd"/>
+      <w:r>
+        <w:t xml:space="preserve"> (converted from parquet format). </w:t>
+      </w:r>
+      <w:r>
+        <w:t>For this analysis, Excel was used to profile the bank.csv dataset, while SQL queries in PostgreSQL (</w:t>
+      </w:r>
+      <w:proofErr w:type="spellStart"/>
+      <w:r>
+        <w:t>DBeaver</w:t>
+      </w:r>
+      <w:proofErr w:type="spellEnd"/>
+      <w:r>
+        <w:t xml:space="preserve">) were used to analyze the </w:t>
+      </w:r>
+      <w:proofErr w:type="spellStart"/>
+      <w:r>
+        <w:t>car_prices</w:t>
+      </w:r>
+      <w:proofErr w:type="spellEnd"/>
+      <w:r>
+        <w:t xml:space="preserve"> dataset</w:t>
+      </w:r>
+      <w:r>
+        <w:t xml:space="preserve"> </w:t>
+      </w:r>
+      <w:r>
+        <w:t>to identify data anomalies. The bank dataset contains 4,521 customer records with 10 attributes, while the car prices dataset comprises vehicle sales records with 16 specification and transaction-related fields. Both datasets exhibit quality issues that require remediation before use in analytical or production systems. This report documents specific anomalies identified, their impact, and recommended actions.</w:t>
       </w:r>
     </w:p>
     <w:p>
@@ -1361,7 +1394,15 @@
         <w:pStyle w:val="BodyText"/>
       </w:pPr>
       <w:r>
-        <w:t>The car_prices dataset comes in two different formats with very different file sizes. The parquet file is 17.3 MB while the CSV file is 90.3 MB</w:t>
+        <w:t xml:space="preserve">The </w:t>
+      </w:r>
+      <w:proofErr w:type="spellStart"/>
+      <w:r>
+        <w:t>car_prices</w:t>
+      </w:r>
+      <w:proofErr w:type="spellEnd"/>
+      <w:r>
+        <w:t xml:space="preserve"> dataset comes in two different formats with very different file sizes. The parquet file is 17.3 MB while the CSV file is 90.3 MB</w:t>
       </w:r>
       <w:r>
         <w:t xml:space="preserve"> (shown in Figure 1)</w:t>
@@ -1384,6 +1425,9 @@
         <w:keepNext/>
       </w:pPr>
       <w:r>
+        <w:rPr>
+          <w:noProof/>
+        </w:rPr>
         <w:drawing>
           <wp:inline distT="0" distB="0" distL="0" distR="0" wp14:anchorId="5B6F1883" wp14:editId="500C4DCE">
             <wp:extent cx="5915851" cy="657317"/>
@@ -1469,7 +1513,29 @@
         <w:rPr>
           <w:rFonts w:ascii="Trebuchet MS" w:hAnsi="Trebuchet MS"/>
         </w:rPr>
-        <w:t>. car_prices.parquet and car_prices.csv file size comparison</w:t>
+        <w:t xml:space="preserve">. </w:t>
+      </w:r>
+      <w:proofErr w:type="spellStart"/>
+      <w:r>
+        <w:rPr>
+          <w:rFonts w:ascii="Trebuchet MS" w:hAnsi="Trebuchet MS"/>
+        </w:rPr>
+        <w:t>car_</w:t>
+      </w:r>
+      <w:proofErr w:type="gramStart"/>
+      <w:r>
+        <w:rPr>
+          <w:rFonts w:ascii="Trebuchet MS" w:hAnsi="Trebuchet MS"/>
+        </w:rPr>
+        <w:t>prices.parquet</w:t>
+      </w:r>
+      <w:proofErr w:type="spellEnd"/>
+      <w:proofErr w:type="gramEnd"/>
+      <w:r>
+        <w:rPr>
+          <w:rFonts w:ascii="Trebuchet MS" w:hAnsi="Trebuchet MS"/>
+        </w:rPr>
+        <w:t xml:space="preserve"> and car_prices.csv file size comparison</w:t>
       </w:r>
     </w:p>
     <w:p>
@@ -1525,11 +1591,23 @@
         <w:pStyle w:val="BodyText"/>
       </w:pPr>
       <w:r>
-        <w:t xml:space="preserve">The car_prices dataset has 558,837 records of used car auction sales with 16 different data fields. Each record includes vehicle details like the year it was made, the make and model, the trim level, body type, transmission type, and the vehicle condition rating. The data also includes sale information like who sold it, when it was sold, what price it sold for, and what the manufacturer's suggested value was. Other fields track the odometer reading, color, interior type, state where it was sold, and the vehicle's VIN (identification number). </w:t>
+        <w:t xml:space="preserve">The </w:t>
+      </w:r>
+      <w:proofErr w:type="spellStart"/>
+      <w:r>
+        <w:t>car_prices</w:t>
+      </w:r>
+      <w:proofErr w:type="spellEnd"/>
+      <w:r>
+        <w:t xml:space="preserve"> dataset has 558,837 records of used car auction sales with 16 different data fields. Each record includes vehicle details like the year it was made, the make and model, the trim level, body type, transmission type, and the vehicle condition rating. The data also includes sale information like who sold it, when it was sold, what price it sold for, and what the manufacturer's suggested value was. Other fields track the odometer reading, color, interior type, state where it was sold, and the vehicle's VIN (identification number). </w:t>
       </w:r>
       <w:bookmarkStart w:id="14" w:name="_Toc239364791"/>
       <w:r>
-        <w:t>From a business perspective, this dataset is highly useful for used car dealers in pricing strategy development, for automotive market analysts tracking price trends over time periods, and for financial institutions assessing vehicle value for loan collateral purposes.</w:t>
+        <w:t xml:space="preserve">From a business perspective, this dataset is highly useful for used car dealers in pricing strategy development, for automotive market analysts tracking price trends over </w:t>
+      </w:r>
+      <w:r>
+        <w:lastRenderedPageBreak/>
+        <w:t>time periods, and for financial institutions assessing vehicle value for loan collateral purposes.</w:t>
       </w:r>
     </w:p>
     <w:p>
@@ -1537,7 +1615,6 @@
         <w:pStyle w:val="Heading1"/>
       </w:pPr>
       <w:r>
-        <w:lastRenderedPageBreak/>
         <w:t>Data Anomalies Found</w:t>
       </w:r>
       <w:bookmarkEnd w:id="14"/>
@@ -1635,6 +1712,9 @@
         <w:keepNext/>
       </w:pPr>
       <w:r>
+        <w:rPr>
+          <w:noProof/>
+        </w:rPr>
         <w:drawing>
           <wp:inline distT="0" distB="0" distL="0" distR="0" wp14:anchorId="1A1B51FC" wp14:editId="5BB233F5">
             <wp:extent cx="5941695" cy="2346325"/>
@@ -1774,7 +1854,11 @@
         <w:pStyle w:val="BodyText"/>
       </w:pPr>
       <w:r>
-        <w:t>Detection method: Reviewed the list of unique values in the job column using Excel filter dropdown and counted occurrences.</w:t>
+        <w:t xml:space="preserve">Detection method: Reviewed the list of unique values in the job column using Excel filter dropdown </w:t>
+      </w:r>
+      <w:r>
+        <w:lastRenderedPageBreak/>
+        <w:t>and counted occurrences.</w:t>
       </w:r>
     </w:p>
     <w:p>
@@ -1782,7 +1866,6 @@
         <w:pStyle w:val="BodyText"/>
       </w:pPr>
       <w:r>
-        <w:lastRenderedPageBreak/>
         <w:t>Assessment: The "boogieman" value appears to be a data entry error or placeholder value that was not properly validated during data input. The inconsistent "admin." formatting suggests incomplete standardization during data processing. Both issues indicate that this column lacked proper validation rules during data collection or loading. All job values should be standardized to consistent formats and validated against an approved list of occupation categories. Invalid entries like "boogieman" should be reclassified or removed depending on data governance policies.</w:t>
       </w:r>
     </w:p>
@@ -1900,6 +1983,9 @@
         <w:keepNext/>
       </w:pPr>
       <w:r>
+        <w:rPr>
+          <w:noProof/>
+        </w:rPr>
         <w:drawing>
           <wp:inline distT="0" distB="0" distL="0" distR="0" wp14:anchorId="77D2CD66" wp14:editId="09B43C94">
             <wp:extent cx="2475730" cy="3321170"/>
@@ -2002,6 +2088,7 @@
         <w:pStyle w:val="CommentSubject"/>
       </w:pPr>
       <w:r>
+        <w:lastRenderedPageBreak/>
         <w:t>Anomaly 5: Unexpected Negative and Zero Balance Values</w:t>
       </w:r>
     </w:p>
@@ -2018,7 +2105,6 @@
           <w:b/>
           <w:bCs/>
         </w:rPr>
-        <w:lastRenderedPageBreak/>
         <w:t>Attribute: balance</w:t>
       </w:r>
     </w:p>
@@ -2049,7 +2135,15 @@
         <w:pStyle w:val="BodyText"/>
       </w:pPr>
       <w:r>
-        <w:t>Assessment: Negative balances may indicate overdrawn accounts or data errors. If these are legitimate overdraft situations, they should be flagged for review. If they are errors, they require correction. The high count of exact zero values also warrants investigation to determine if these represent closed accounts, data entry defaults, or actual zero balances.</w:t>
+        <w:t xml:space="preserve">Assessment: Negative balances may indicate overdrawn accounts or data errors. If these are legitimate overdraft situations, they should be flagged for review. If they are errors, they require correction. The high count of exact zero values also </w:t>
+      </w:r>
+      <w:proofErr w:type="gramStart"/>
+      <w:r>
+        <w:t>warrants</w:t>
+      </w:r>
+      <w:proofErr w:type="gramEnd"/>
+      <w:r>
+        <w:t xml:space="preserve"> investigation to determine if these represent closed accounts, data entry defaults, or actual zero balances.</w:t>
       </w:r>
     </w:p>
     <w:p>
@@ -2118,6 +2212,9 @@
         <w:keepNext/>
       </w:pPr>
       <w:r>
+        <w:rPr>
+          <w:noProof/>
+        </w:rPr>
         <w:drawing>
           <wp:inline distT="0" distB="0" distL="0" distR="0" wp14:anchorId="7F243797" wp14:editId="406E2BF3">
             <wp:extent cx="2714625" cy="4028536"/>
@@ -2220,6 +2317,7 @@
         <w:pStyle w:val="CommentSubject"/>
       </w:pPr>
       <w:r>
+        <w:lastRenderedPageBreak/>
         <w:t>Anomaly 7: Negative Duration Values</w:t>
       </w:r>
     </w:p>
@@ -2244,14 +2342,7 @@
         <w:pStyle w:val="BodyText"/>
       </w:pPr>
       <w:r>
-        <w:lastRenderedPageBreak/>
-        <w:t xml:space="preserve">Issue: The duration column contains 45 records with a value of </w:t>
-      </w:r>
-      <w:r>
-        <w:t>-</w:t>
-      </w:r>
-      <w:r>
-        <w:t>999, which is impossible. Duration represents call or interaction length and cannot be negative. The legitimate maximum duration is 3,025.</w:t>
+        <w:t>Issue: The duration column contains 45 records with a value of -999, which is impossible. Duration represents call or interaction length and cannot be negative. The legitimate maximum duration is 3,025.</w:t>
       </w:r>
     </w:p>
     <w:p>
@@ -2285,8 +2376,13 @@
         <w:pStyle w:val="CommentSubject"/>
       </w:pPr>
       <w:r>
-        <w:t>Dataset: car_prices</w:t>
-      </w:r>
+        <w:t xml:space="preserve">Dataset: </w:t>
+      </w:r>
+      <w:proofErr w:type="spellStart"/>
+      <w:r>
+        <w:t>car_prices</w:t>
+      </w:r>
+      <w:proofErr w:type="spellEnd"/>
       <w:r>
         <w:br/>
       </w:r>
@@ -2349,6 +2445,9 @@
         <w:keepNext/>
       </w:pPr>
       <w:r>
+        <w:rPr>
+          <w:noProof/>
+        </w:rPr>
         <w:drawing>
           <wp:inline distT="0" distB="0" distL="0" distR="0" wp14:anchorId="77B8FD0F" wp14:editId="6BD9D460">
             <wp:extent cx="3781953" cy="2299160"/>
@@ -2440,14 +2539,22 @@
         <w:rPr>
           <w:rFonts w:ascii="Trebuchet MS" w:hAnsi="Trebuchet MS"/>
         </w:rPr>
-        <w:t>.  SQL query and results showing the min_</w:t>
-      </w:r>
+        <w:t xml:space="preserve">.  SQL query and results showing the </w:t>
+      </w:r>
+      <w:proofErr w:type="spellStart"/>
       <w:r>
         <w:rPr>
           <w:rFonts w:ascii="Trebuchet MS" w:hAnsi="Trebuchet MS"/>
         </w:rPr>
+        <w:t>min_</w:t>
+      </w:r>
+      <w:r>
+        <w:rPr>
+          <w:rFonts w:ascii="Trebuchet MS" w:hAnsi="Trebuchet MS"/>
+        </w:rPr>
         <w:t>condition</w:t>
       </w:r>
+      <w:proofErr w:type="spellEnd"/>
       <w:r>
         <w:rPr>
           <w:rFonts w:ascii="Trebuchet MS" w:hAnsi="Trebuchet MS"/>
@@ -2539,11 +2646,8 @@
         <w:pStyle w:val="BodyText"/>
       </w:pPr>
       <w:r>
-        <w:t xml:space="preserve">Assessment: Odometer readings of 0 and 1 are implausible for used vehicles, as virtually all vehicles have some mileage by the time they are sold. These exact values appear to be placeholder values or data entry defaults rather than genuine mileage readings. Combined with the 246 NULL or negative </w:t>
-      </w:r>
-      <w:r>
         <w:lastRenderedPageBreak/>
-        <w:t>records, approximately 1,716 records lack reliable odometer information. This is critical for vehicle valuation, as mileage is one of the primary factors in pricing. These records should either be excluded from analysis or flagged for special handling and investigation into their data source.</w:t>
+        <w:t>Assessment: Odometer readings of 0 and 1 are implausible for used vehicles, as virtually all vehicles have some mileage by the time they are sold. These exact values appear to be placeholder values or data entry defaults rather than genuine mileage readings. Combined with the 246 NULL or negative records, approximately 1,716 records lack reliable odometer information. This is critical for vehicle valuation, as mileage is one of the primary factors in pricing. These records should either be excluded from analysis or flagged for special handling and investigation into their data source.</w:t>
       </w:r>
     </w:p>
     <w:p>
@@ -2552,6 +2656,9 @@
         <w:keepNext/>
       </w:pPr>
       <w:r>
+        <w:rPr>
+          <w:noProof/>
+        </w:rPr>
         <w:drawing>
           <wp:inline distT="0" distB="0" distL="0" distR="0" wp14:anchorId="3098A12F" wp14:editId="6A6C50C1">
             <wp:extent cx="4772691" cy="2448267"/>
@@ -2646,6 +2753,9 @@
         <w:keepNext/>
       </w:pPr>
       <w:r>
+        <w:rPr>
+          <w:noProof/>
+        </w:rPr>
         <w:drawing>
           <wp:inline distT="0" distB="0" distL="0" distR="0" wp14:anchorId="64CBBA84" wp14:editId="76BF3CB5">
             <wp:extent cx="4143953" cy="2343477"/>
@@ -2831,11 +2941,16 @@
         <w:pStyle w:val="BodyText"/>
       </w:pPr>
       <w:r>
-        <w:t xml:space="preserve">Assessment: The high number of missing values in transmission (65,321) is particularly concerning, suggesting either systematic data collection failures or data loss. Make and model information is </w:t>
-      </w:r>
-      <w:r>
         <w:lastRenderedPageBreak/>
-        <w:t>essential for vehicle identification and pricing, so their absence is problematic. These missing values significantly limit the dataset's usability for detailed vehicle analysis and pricing models. The root cause of these missing values should be investigated.</w:t>
+        <w:t xml:space="preserve">Assessment: The high number of missing values in transmission (65,321) is particularly concerning, suggesting either systematic data collection failures or data loss. </w:t>
+      </w:r>
+      <w:proofErr w:type="gramStart"/>
+      <w:r>
+        <w:t>Make</w:t>
+      </w:r>
+      <w:proofErr w:type="gramEnd"/>
+      <w:r>
+        <w:t xml:space="preserve"> and model information is essential for vehicle identification and pricing, so their absence is problematic. These missing values significantly limit the dataset's usability for detailed vehicle analysis and pricing models. The root cause of these missing values should be investigated.</w:t>
       </w:r>
     </w:p>
     <w:p>
@@ -2844,6 +2959,9 @@
         <w:keepNext/>
       </w:pPr>
       <w:r>
+        <w:rPr>
+          <w:noProof/>
+        </w:rPr>
         <w:drawing>
           <wp:inline distT="0" distB="0" distL="0" distR="0" wp14:anchorId="48F2CF3F" wp14:editId="1D82B5C4">
             <wp:extent cx="5941695" cy="1974850"/>
@@ -2978,10 +3096,7 @@
         <w:t>Detection method: SQL query grouping by VIN and counting occurrences, filtering for counts greater than 1</w:t>
       </w:r>
       <w:r>
-        <w:t xml:space="preserve"> </w:t>
-      </w:r>
-      <w:r>
-        <w:t>(see Figure</w:t>
+        <w:t xml:space="preserve"> (see Figure</w:t>
       </w:r>
       <w:r>
         <w:t xml:space="preserve"> 9)</w:t>
@@ -3004,6 +3119,9 @@
         <w:keepNext/>
       </w:pPr>
       <w:r>
+        <w:rPr>
+          <w:noProof/>
+        </w:rPr>
         <w:lastRenderedPageBreak/>
         <w:drawing>
           <wp:inline distT="0" distB="0" distL="0" distR="0" wp14:anchorId="3BFBA6FA" wp14:editId="40419F42">
@@ -3114,7 +3232,23 @@
         <w:pStyle w:val="BodyText"/>
       </w:pPr>
       <w:r>
-        <w:t>Issue: The dataset contains vehicles ranging from 1982 to 2015 (33 year span). While this alone is not necessarily problematic, it should be verified that this range is intentional and appropriate for the analysis purpose.</w:t>
+        <w:t>Issue: The dataset contains vehicles ranging from 1982 to 2015 (</w:t>
+      </w:r>
+      <w:proofErr w:type="gramStart"/>
+      <w:r>
+        <w:t>33 year</w:t>
+      </w:r>
+      <w:proofErr w:type="gramEnd"/>
+      <w:r>
+        <w:t xml:space="preserve"> span). While this alone is not necessarily problematic, it should be verified that this range is intentional and appropriate for </w:t>
+      </w:r>
+      <w:proofErr w:type="gramStart"/>
+      <w:r>
+        <w:t>the analysis purpose</w:t>
+      </w:r>
+      <w:proofErr w:type="gramEnd"/>
+      <w:r>
+        <w:t>.</w:t>
       </w:r>
     </w:p>
     <w:p>
@@ -3143,7 +3277,15 @@
       </w:pPr>
       <w:r>
         <w:lastRenderedPageBreak/>
-        <w:t>Assessment: This range is reasonable for a used car dataset, though the reason for the specific cutoff at 2015 should be verified. Ensure that any analysis accounts for the age of vehicles, as a 1982 vehicle and a 2015 vehicle are fundamentally different assets. This is important context for pricing and condition analysis.</w:t>
+        <w:t xml:space="preserve">Assessment: This range is reasonable for a used car dataset, though the reason for the specific cutoff </w:t>
+      </w:r>
+      <w:proofErr w:type="gramStart"/>
+      <w:r>
+        <w:t>at</w:t>
+      </w:r>
+      <w:proofErr w:type="gramEnd"/>
+      <w:r>
+        <w:t xml:space="preserve"> 2015 should be verified. Ensure that any analysis accounts for the age of vehicles, as a 1982 vehicle and a 2015 vehicle are fundamentally different assets. This is important context for pricing and condition analysis.</w:t>
       </w:r>
     </w:p>
     <w:p>
@@ -3152,6 +3294,9 @@
         <w:keepNext/>
       </w:pPr>
       <w:r>
+        <w:rPr>
+          <w:noProof/>
+        </w:rPr>
         <w:drawing>
           <wp:inline distT="0" distB="0" distL="0" distR="0" wp14:anchorId="697BCAA6" wp14:editId="4D1A3193">
             <wp:extent cx="3667637" cy="2562583"/>
@@ -3268,7 +3413,15 @@
         <w:pStyle w:val="BodyText"/>
       </w:pPr>
       <w:r>
-        <w:t>Before proceeding with any analysis, I recommend establishing a data validation and cleansing workflow. This should include removing or correcting records with clearly impossible values, standardizing all categorical fields to consistent formats, investigating the root causes of the high volume of missing values, and deduplicating records where appropriate.</w:t>
+        <w:t xml:space="preserve">Before proceeding with any analysis, I recommend establishing </w:t>
+      </w:r>
+      <w:proofErr w:type="gramStart"/>
+      <w:r>
+        <w:t>a data</w:t>
+      </w:r>
+      <w:proofErr w:type="gramEnd"/>
+      <w:r>
+        <w:t xml:space="preserve"> validation and cleansing workflow. This should include removing or correcting records with clearly impossible values, standardizing all categorical fields to consistent formats, investigating the root causes of the high volume of missing values, and deduplicating records where appropriate.</w:t>
       </w:r>
     </w:p>
     <w:p>
@@ -9277,24 +9430,6 @@
 </file>
 
 <file path=customXml/item2.xml><?xml version="1.0" encoding="utf-8"?>
-<b:Sources xmlns:b="http://schemas.openxmlformats.org/officeDocument/2006/bibliography" xmlns="http://schemas.openxmlformats.org/officeDocument/2006/bibliography" SelectedStyle="\HarvardAnglia2008OfficeOnline.xsl" StyleName="Harvard - Anglia" Version="2008"/>
-</file>
-
-<file path=customXml/item3.xml><?xml version="1.0" encoding="utf-8"?>
-<p:properties xmlns:p="http://schemas.microsoft.com/office/2006/metadata/properties" xmlns:xsi="http://www.w3.org/2001/XMLSchema-instance" xmlns:pc="http://schemas.microsoft.com/office/infopath/2007/PartnerControls">
-  <documentManagement>
-    <SharedWithUsers xmlns="7f0dcb33-685e-48d8-b644-2ef2786c1229">
-      <UserInfo>
-        <DisplayName/>
-        <AccountId xsi:nil="true"/>
-        <AccountType/>
-      </UserInfo>
-    </SharedWithUsers>
-  </documentManagement>
-</p:properties>
-</file>
-
-<file path=customXml/item4.xml><?xml version="1.0" encoding="utf-8"?>
 <ct:contentTypeSchema xmlns:ct="http://schemas.microsoft.com/office/2006/metadata/contentType" xmlns:ma="http://schemas.microsoft.com/office/2006/metadata/properties/metaAttributes" ct:_="" ma:_="" ma:contentTypeName="Document" ma:contentTypeID="0x010100B3483E581E535547A5C5133F57803043" ma:contentTypeVersion="7" ma:contentTypeDescription="Create a new document." ma:contentTypeScope="" ma:versionID="26f0e3c34181377a2b428b97b0aacf58">
   <xsd:schema xmlns:xsd="http://www.w3.org/2001/XMLSchema" xmlns:xs="http://www.w3.org/2001/XMLSchema" xmlns:p="http://schemas.microsoft.com/office/2006/metadata/properties" xmlns:ns2="0a074a96-e172-4849-a42b-0522bc04182b" xmlns:ns3="7f0dcb33-685e-48d8-b644-2ef2786c1229" targetNamespace="http://schemas.microsoft.com/office/2006/metadata/properties" ma:root="true" ma:fieldsID="c6eeec6c9df2cadb2fce64bd00511549" ns2:_="" ns3:_="">
     <xsd:import namespace="0a074a96-e172-4849-a42b-0522bc04182b"/>
@@ -9479,6 +9614,24 @@
 </ct:contentTypeSchema>
 </file>
 
+<file path=customXml/item3.xml><?xml version="1.0" encoding="utf-8"?>
+<p:properties xmlns:p="http://schemas.microsoft.com/office/2006/metadata/properties" xmlns:xsi="http://www.w3.org/2001/XMLSchema-instance" xmlns:pc="http://schemas.microsoft.com/office/infopath/2007/PartnerControls">
+  <documentManagement>
+    <SharedWithUsers xmlns="7f0dcb33-685e-48d8-b644-2ef2786c1229">
+      <UserInfo>
+        <DisplayName/>
+        <AccountId xsi:nil="true"/>
+        <AccountType/>
+      </UserInfo>
+    </SharedWithUsers>
+  </documentManagement>
+</p:properties>
+</file>
+
+<file path=customXml/item4.xml><?xml version="1.0" encoding="utf-8"?>
+<b:Sources xmlns:b="http://schemas.openxmlformats.org/officeDocument/2006/bibliography" xmlns="http://schemas.openxmlformats.org/officeDocument/2006/bibliography" SelectedStyle="\HarvardAnglia2008OfficeOnline.xsl" StyleName="Harvard - Anglia" Version="2008"/>
+</file>
+
 <file path=customXml/itemProps1.xml><?xml version="1.0" encoding="utf-8"?>
 <ds:datastoreItem xmlns:ds="http://schemas.openxmlformats.org/officeDocument/2006/customXml" ds:itemID="{CEAD825D-2413-46BA-BB1F-DCE637B19B0C}">
   <ds:schemaRefs>
@@ -9488,24 +9641,6 @@
 </file>
 
 <file path=customXml/itemProps2.xml><?xml version="1.0" encoding="utf-8"?>
-<ds:datastoreItem xmlns:ds="http://schemas.openxmlformats.org/officeDocument/2006/customXml" ds:itemID="{FDBCFBA0-8D1D-4B98-8BFA-B2B6E4DF45A4}">
-  <ds:schemaRefs>
-    <ds:schemaRef ds:uri="http://schemas.openxmlformats.org/officeDocument/2006/bibliography"/>
-  </ds:schemaRefs>
-</ds:datastoreItem>
-</file>
-
-<file path=customXml/itemProps3.xml><?xml version="1.0" encoding="utf-8"?>
-<ds:datastoreItem xmlns:ds="http://schemas.openxmlformats.org/officeDocument/2006/customXml" ds:itemID="{E4B4D352-B35B-4B3A-95D2-902933709BD2}">
-  <ds:schemaRefs>
-    <ds:schemaRef ds:uri="http://schemas.microsoft.com/office/2006/metadata/properties"/>
-    <ds:schemaRef ds:uri="http://schemas.microsoft.com/office/infopath/2007/PartnerControls"/>
-    <ds:schemaRef ds:uri="7f0dcb33-685e-48d8-b644-2ef2786c1229"/>
-  </ds:schemaRefs>
-</ds:datastoreItem>
-</file>
-
-<file path=customXml/itemProps4.xml><?xml version="1.0" encoding="utf-8"?>
 <ds:datastoreItem xmlns:ds="http://schemas.openxmlformats.org/officeDocument/2006/customXml" ds:itemID="{2240CE2F-0274-489A-BA80-8887BFB6B269}">
   <ds:schemaRefs>
     <ds:schemaRef ds:uri="http://schemas.microsoft.com/office/2006/metadata/contentType"/>
@@ -9522,4 +9657,22 @@
     <ds:schemaRef ds:uri="http://schemas.microsoft.com/internal/obd"/>
   </ds:schemaRefs>
 </ds:datastoreItem>
+</file>
+
+<file path=customXml/itemProps3.xml><?xml version="1.0" encoding="utf-8"?>
+<ds:datastoreItem xmlns:ds="http://schemas.openxmlformats.org/officeDocument/2006/customXml" ds:itemID="{E4B4D352-B35B-4B3A-95D2-902933709BD2}">
+  <ds:schemaRefs>
+    <ds:schemaRef ds:uri="http://schemas.microsoft.com/office/2006/metadata/properties"/>
+    <ds:schemaRef ds:uri="http://schemas.microsoft.com/office/infopath/2007/PartnerControls"/>
+    <ds:schemaRef ds:uri="7f0dcb33-685e-48d8-b644-2ef2786c1229"/>
+  </ds:schemaRefs>
+</ds:datastoreItem>
+</file>
+
+<file path=customXml/itemProps4.xml><?xml version="1.0" encoding="utf-8"?>
+<ds:datastoreItem xmlns:ds="http://schemas.openxmlformats.org/officeDocument/2006/customXml" ds:itemID="{FDBCFBA0-8D1D-4B98-8BFA-B2B6E4DF45A4}">
+  <ds:schemaRefs>
+    <ds:schemaRef ds:uri="http://schemas.openxmlformats.org/officeDocument/2006/bibliography"/>
+  </ds:schemaRefs>
+</ds:datastoreItem>
 </file>
</xml_diff>